<commit_message>
Fixed one drive sourcing
</commit_message>
<xml_diff>
--- a/resources/App Update Notes.docx
+++ b/resources/App Update Notes.docx
@@ -243,6 +243,99 @@
       <w:r>
         <w:t>Haven’t had a chance to investigate yet</w:t>
       </w:r>
+    </w:p>
+    <w:p/>
+    <w:p/>
+    <w:p>
+      <w:pPr>
+        <w:rPr>
+          <w:b/>
+          <w:bCs/>
+        </w:rPr>
+      </w:pPr>
+      <w:r>
+        <w:rPr>
+          <w:b/>
+          <w:bCs/>
+        </w:rPr>
+        <w:t>Alex 23 January</w:t>
+      </w:r>
+    </w:p>
+    <w:p>
+      <w:pPr>
+        <w:pStyle w:val="ListParagraph"/>
+        <w:numPr>
+          <w:ilvl w:val="0"/>
+          <w:numId w:val="2"/>
+        </w:numPr>
+      </w:pPr>
+      <w:r>
+        <w:t>I have split the logic and app code into two separate files</w:t>
+      </w:r>
+      <w:r>
+        <w:t>, so that easier to work with and to set-up a testing framework</w:t>
+      </w:r>
+    </w:p>
+    <w:p>
+      <w:pPr>
+        <w:pStyle w:val="ListParagraph"/>
+        <w:numPr>
+          <w:ilvl w:val="0"/>
+          <w:numId w:val="2"/>
+        </w:numPr>
+      </w:pPr>
+      <w:r>
+        <w:t xml:space="preserve">These have been linked via </w:t>
+      </w:r>
+      <w:proofErr w:type="spellStart"/>
+      <w:r>
+        <w:t>onedrive</w:t>
+      </w:r>
+      <w:proofErr w:type="spellEnd"/>
+      <w:r>
+        <w:t xml:space="preserve"> for now (tested that link should work on Megan’s computer) – </w:t>
+      </w:r>
+      <w:proofErr w:type="spellStart"/>
+      <w:r>
+        <w:t>github</w:t>
+      </w:r>
+      <w:proofErr w:type="spellEnd"/>
+      <w:r>
+        <w:t xml:space="preserve"> would be better in future</w:t>
+      </w:r>
+    </w:p>
+    <w:p>
+      <w:pPr>
+        <w:pStyle w:val="ListParagraph"/>
+        <w:numPr>
+          <w:ilvl w:val="0"/>
+          <w:numId w:val="2"/>
+        </w:numPr>
+      </w:pPr>
+      <w:r>
+        <w:t>Fixed the null on infections and key epi parameters and added some basic data from GAM where available</w:t>
+      </w:r>
+    </w:p>
+    <w:p>
+      <w:pPr>
+        <w:pStyle w:val="ListParagraph"/>
+        <w:numPr>
+          <w:ilvl w:val="0"/>
+          <w:numId w:val="2"/>
+        </w:numPr>
+      </w:pPr>
+      <w:r>
+        <w:t>Files:</w:t>
+      </w:r>
+    </w:p>
+    <w:p>
+      <w:pPr>
+        <w:pStyle w:val="ListParagraph"/>
+        <w:numPr>
+          <w:ilvl w:val="1"/>
+          <w:numId w:val="2"/>
+        </w:numPr>
+      </w:pPr>
     </w:p>
     <w:sectPr>
       <w:pgSz w:w="11906" w:h="16838"/>
@@ -368,8 +461,123 @@
       </w:rPr>
     </w:lvl>
   </w:abstractNum>
+  <w:abstractNum w:abstractNumId="1" w15:restartNumberingAfterBreak="0">
+    <w:nsid w:val="5CB00665"/>
+    <w:multiLevelType w:val="hybridMultilevel"/>
+    <w:tmpl w:val="C8B20128"/>
+    <w:lvl w:ilvl="0" w:tplc="32B8264E">
+      <w:numFmt w:val="bullet"/>
+      <w:lvlText w:val="-"/>
+      <w:lvlJc w:val="left"/>
+      <w:pPr>
+        <w:ind w:left="360" w:hanging="360"/>
+      </w:pPr>
+      <w:rPr>
+        <w:rFonts w:ascii="Aptos" w:eastAsiaTheme="minorHAnsi" w:hAnsi="Aptos" w:cstheme="minorBidi" w:hint="default"/>
+      </w:rPr>
+    </w:lvl>
+    <w:lvl w:ilvl="1" w:tplc="08090003">
+      <w:start w:val="1"/>
+      <w:numFmt w:val="bullet"/>
+      <w:lvlText w:val="o"/>
+      <w:lvlJc w:val="left"/>
+      <w:pPr>
+        <w:ind w:left="1440" w:hanging="360"/>
+      </w:pPr>
+      <w:rPr>
+        <w:rFonts w:ascii="Courier New" w:hAnsi="Courier New" w:cs="Courier New" w:hint="default"/>
+      </w:rPr>
+    </w:lvl>
+    <w:lvl w:ilvl="2" w:tplc="08090005" w:tentative="1">
+      <w:start w:val="1"/>
+      <w:numFmt w:val="bullet"/>
+      <w:lvlText w:val=""/>
+      <w:lvlJc w:val="left"/>
+      <w:pPr>
+        <w:ind w:left="2160" w:hanging="360"/>
+      </w:pPr>
+      <w:rPr>
+        <w:rFonts w:ascii="Wingdings" w:hAnsi="Wingdings" w:hint="default"/>
+      </w:rPr>
+    </w:lvl>
+    <w:lvl w:ilvl="3" w:tplc="08090001" w:tentative="1">
+      <w:start w:val="1"/>
+      <w:numFmt w:val="bullet"/>
+      <w:lvlText w:val=""/>
+      <w:lvlJc w:val="left"/>
+      <w:pPr>
+        <w:ind w:left="2880" w:hanging="360"/>
+      </w:pPr>
+      <w:rPr>
+        <w:rFonts w:ascii="Symbol" w:hAnsi="Symbol" w:hint="default"/>
+      </w:rPr>
+    </w:lvl>
+    <w:lvl w:ilvl="4" w:tplc="08090003" w:tentative="1">
+      <w:start w:val="1"/>
+      <w:numFmt w:val="bullet"/>
+      <w:lvlText w:val="o"/>
+      <w:lvlJc w:val="left"/>
+      <w:pPr>
+        <w:ind w:left="3600" w:hanging="360"/>
+      </w:pPr>
+      <w:rPr>
+        <w:rFonts w:ascii="Courier New" w:hAnsi="Courier New" w:cs="Courier New" w:hint="default"/>
+      </w:rPr>
+    </w:lvl>
+    <w:lvl w:ilvl="5" w:tplc="08090005" w:tentative="1">
+      <w:start w:val="1"/>
+      <w:numFmt w:val="bullet"/>
+      <w:lvlText w:val=""/>
+      <w:lvlJc w:val="left"/>
+      <w:pPr>
+        <w:ind w:left="4320" w:hanging="360"/>
+      </w:pPr>
+      <w:rPr>
+        <w:rFonts w:ascii="Wingdings" w:hAnsi="Wingdings" w:hint="default"/>
+      </w:rPr>
+    </w:lvl>
+    <w:lvl w:ilvl="6" w:tplc="08090001" w:tentative="1">
+      <w:start w:val="1"/>
+      <w:numFmt w:val="bullet"/>
+      <w:lvlText w:val=""/>
+      <w:lvlJc w:val="left"/>
+      <w:pPr>
+        <w:ind w:left="5040" w:hanging="360"/>
+      </w:pPr>
+      <w:rPr>
+        <w:rFonts w:ascii="Symbol" w:hAnsi="Symbol" w:hint="default"/>
+      </w:rPr>
+    </w:lvl>
+    <w:lvl w:ilvl="7" w:tplc="08090003" w:tentative="1">
+      <w:start w:val="1"/>
+      <w:numFmt w:val="bullet"/>
+      <w:lvlText w:val="o"/>
+      <w:lvlJc w:val="left"/>
+      <w:pPr>
+        <w:ind w:left="5760" w:hanging="360"/>
+      </w:pPr>
+      <w:rPr>
+        <w:rFonts w:ascii="Courier New" w:hAnsi="Courier New" w:cs="Courier New" w:hint="default"/>
+      </w:rPr>
+    </w:lvl>
+    <w:lvl w:ilvl="8" w:tplc="08090005" w:tentative="1">
+      <w:start w:val="1"/>
+      <w:numFmt w:val="bullet"/>
+      <w:lvlText w:val=""/>
+      <w:lvlJc w:val="left"/>
+      <w:pPr>
+        <w:ind w:left="6480" w:hanging="360"/>
+      </w:pPr>
+      <w:rPr>
+        <w:rFonts w:ascii="Wingdings" w:hAnsi="Wingdings" w:hint="default"/>
+      </w:rPr>
+    </w:lvl>
+  </w:abstractNum>
   <w:num w:numId="1" w16cid:durableId="187376041">
     <w:abstractNumId w:val="0"/>
+  </w:num>
+  <w:num w:numId="2" w16cid:durableId="694236038">
+    <w:abstractNumId w:val="1"/>
   </w:num>
 </w:numbering>
 </file>

</xml_diff>

<commit_message>
Updating to fix sourcing
</commit_message>
<xml_diff>
--- a/resources/App Update Notes.docx
+++ b/resources/App Update Notes.docx
@@ -336,6 +336,134 @@
           <w:numId w:val="2"/>
         </w:numPr>
       </w:pPr>
+      <w:r>
+        <w:t xml:space="preserve">App: </w:t>
+      </w:r>
+      <w:hyperlink r:id="rId7" w:history="1">
+        <w:r>
+          <w:rPr>
+            <w:rStyle w:val="Hyperlink"/>
+          </w:rPr>
+          <w:t>https://1drv.ms/u/c/2ae90f5cbd0fd171/IQDdS_PU4WXiQpgxkqxWg9WcAc4LTVFLmHGm73pF7tQX75Q?e=KyeMiV</w:t>
+        </w:r>
+      </w:hyperlink>
+    </w:p>
+    <w:p>
+      <w:pPr>
+        <w:pStyle w:val="ListParagraph"/>
+        <w:numPr>
+          <w:ilvl w:val="1"/>
+          <w:numId w:val="2"/>
+        </w:numPr>
+      </w:pPr>
+      <w:r>
+        <w:t>Logic:</w:t>
+      </w:r>
+      <w:r>
+        <w:t xml:space="preserve"> </w:t>
+      </w:r>
+      <w:hyperlink r:id="rId8" w:history="1">
+        <w:r>
+          <w:rPr>
+            <w:rStyle w:val="Hyperlink"/>
+          </w:rPr>
+          <w:t>https://1drv.ms/u/c/2ae90f5cbd0fd171/IQALoKINHgEwSIqA63uTct6ZATtuNo5pHBXZu3nNxrafapw?e=PJgXFc</w:t>
+        </w:r>
+      </w:hyperlink>
+    </w:p>
+    <w:p>
+      <w:pPr>
+        <w:pStyle w:val="ListParagraph"/>
+        <w:ind w:left="1440"/>
+      </w:pPr>
+    </w:p>
+    <w:p>
+      <w:pPr>
+        <w:pStyle w:val="ListParagraph"/>
+        <w:ind w:left="1440"/>
+      </w:pPr>
+    </w:p>
+    <w:p>
+      <w:pPr>
+        <w:pStyle w:val="ListParagraph"/>
+        <w:ind w:left="1440"/>
+      </w:pPr>
+    </w:p>
+    <w:p>
+      <w:pPr>
+        <w:pStyle w:val="ListParagraph"/>
+        <w:ind w:left="0"/>
+        <w:rPr>
+          <w:b/>
+          <w:bCs/>
+        </w:rPr>
+      </w:pPr>
+      <w:r>
+        <w:rPr>
+          <w:b/>
+          <w:bCs/>
+        </w:rPr>
+        <w:lastRenderedPageBreak/>
+        <w:t>Alex 2</w:t>
+      </w:r>
+      <w:r>
+        <w:rPr>
+          <w:b/>
+          <w:bCs/>
+        </w:rPr>
+        <w:t>6</w:t>
+      </w:r>
+      <w:r>
+        <w:rPr>
+          <w:b/>
+          <w:bCs/>
+        </w:rPr>
+        <w:t xml:space="preserve"> January</w:t>
+      </w:r>
+    </w:p>
+    <w:p>
+      <w:pPr>
+        <w:pStyle w:val="ListParagraph"/>
+        <w:numPr>
+          <w:ilvl w:val="0"/>
+          <w:numId w:val="3"/>
+        </w:numPr>
+      </w:pPr>
+      <w:r>
+        <w:t>Set-up framework for unit testing</w:t>
+      </w:r>
+    </w:p>
+    <w:p>
+      <w:pPr>
+        <w:pStyle w:val="ListParagraph"/>
+        <w:numPr>
+          <w:ilvl w:val="0"/>
+          <w:numId w:val="3"/>
+        </w:numPr>
+      </w:pPr>
+      <w:r>
+        <w:t xml:space="preserve">Test code: </w:t>
+      </w:r>
+      <w:hyperlink r:id="rId9" w:history="1">
+        <w:r>
+          <w:rPr>
+            <w:rStyle w:val="Hyperlink"/>
+          </w:rPr>
+          <w:t>https://1drv.ms/u/c/2ae90f5cbd0fd171/IQCIwJCDCnruRqSnrrFFlF7sAZHWklRcOwkf59EjOcwDxs8?e=jkmqyf</w:t>
+        </w:r>
+      </w:hyperlink>
+    </w:p>
+    <w:p>
+      <w:pPr>
+        <w:pStyle w:val="ListParagraph"/>
+        <w:numPr>
+          <w:ilvl w:val="0"/>
+          <w:numId w:val="3"/>
+        </w:numPr>
+      </w:pPr>
+      <w:r>
+        <w:t xml:space="preserve">Testing document: </w:t>
+      </w:r>
     </w:p>
     <w:sectPr>
       <w:pgSz w:w="11906" w:h="16838"/>
@@ -573,11 +701,126 @@
       </w:rPr>
     </w:lvl>
   </w:abstractNum>
+  <w:abstractNum w:abstractNumId="2" w15:restartNumberingAfterBreak="0">
+    <w:nsid w:val="7B774CBC"/>
+    <w:multiLevelType w:val="hybridMultilevel"/>
+    <w:tmpl w:val="FE7EB81E"/>
+    <w:lvl w:ilvl="0" w:tplc="32B8264E">
+      <w:numFmt w:val="bullet"/>
+      <w:lvlText w:val="-"/>
+      <w:lvlJc w:val="left"/>
+      <w:pPr>
+        <w:ind w:left="360" w:hanging="360"/>
+      </w:pPr>
+      <w:rPr>
+        <w:rFonts w:ascii="Aptos" w:eastAsiaTheme="minorHAnsi" w:hAnsi="Aptos" w:cstheme="minorBidi" w:hint="default"/>
+      </w:rPr>
+    </w:lvl>
+    <w:lvl w:ilvl="1" w:tplc="08090003" w:tentative="1">
+      <w:start w:val="1"/>
+      <w:numFmt w:val="bullet"/>
+      <w:lvlText w:val="o"/>
+      <w:lvlJc w:val="left"/>
+      <w:pPr>
+        <w:ind w:left="1080" w:hanging="360"/>
+      </w:pPr>
+      <w:rPr>
+        <w:rFonts w:ascii="Courier New" w:hAnsi="Courier New" w:cs="Courier New" w:hint="default"/>
+      </w:rPr>
+    </w:lvl>
+    <w:lvl w:ilvl="2" w:tplc="08090005" w:tentative="1">
+      <w:start w:val="1"/>
+      <w:numFmt w:val="bullet"/>
+      <w:lvlText w:val=""/>
+      <w:lvlJc w:val="left"/>
+      <w:pPr>
+        <w:ind w:left="1800" w:hanging="360"/>
+      </w:pPr>
+      <w:rPr>
+        <w:rFonts w:ascii="Wingdings" w:hAnsi="Wingdings" w:hint="default"/>
+      </w:rPr>
+    </w:lvl>
+    <w:lvl w:ilvl="3" w:tplc="08090001" w:tentative="1">
+      <w:start w:val="1"/>
+      <w:numFmt w:val="bullet"/>
+      <w:lvlText w:val=""/>
+      <w:lvlJc w:val="left"/>
+      <w:pPr>
+        <w:ind w:left="2520" w:hanging="360"/>
+      </w:pPr>
+      <w:rPr>
+        <w:rFonts w:ascii="Symbol" w:hAnsi="Symbol" w:hint="default"/>
+      </w:rPr>
+    </w:lvl>
+    <w:lvl w:ilvl="4" w:tplc="08090003" w:tentative="1">
+      <w:start w:val="1"/>
+      <w:numFmt w:val="bullet"/>
+      <w:lvlText w:val="o"/>
+      <w:lvlJc w:val="left"/>
+      <w:pPr>
+        <w:ind w:left="3240" w:hanging="360"/>
+      </w:pPr>
+      <w:rPr>
+        <w:rFonts w:ascii="Courier New" w:hAnsi="Courier New" w:cs="Courier New" w:hint="default"/>
+      </w:rPr>
+    </w:lvl>
+    <w:lvl w:ilvl="5" w:tplc="08090005" w:tentative="1">
+      <w:start w:val="1"/>
+      <w:numFmt w:val="bullet"/>
+      <w:lvlText w:val=""/>
+      <w:lvlJc w:val="left"/>
+      <w:pPr>
+        <w:ind w:left="3960" w:hanging="360"/>
+      </w:pPr>
+      <w:rPr>
+        <w:rFonts w:ascii="Wingdings" w:hAnsi="Wingdings" w:hint="default"/>
+      </w:rPr>
+    </w:lvl>
+    <w:lvl w:ilvl="6" w:tplc="08090001" w:tentative="1">
+      <w:start w:val="1"/>
+      <w:numFmt w:val="bullet"/>
+      <w:lvlText w:val=""/>
+      <w:lvlJc w:val="left"/>
+      <w:pPr>
+        <w:ind w:left="4680" w:hanging="360"/>
+      </w:pPr>
+      <w:rPr>
+        <w:rFonts w:ascii="Symbol" w:hAnsi="Symbol" w:hint="default"/>
+      </w:rPr>
+    </w:lvl>
+    <w:lvl w:ilvl="7" w:tplc="08090003" w:tentative="1">
+      <w:start w:val="1"/>
+      <w:numFmt w:val="bullet"/>
+      <w:lvlText w:val="o"/>
+      <w:lvlJc w:val="left"/>
+      <w:pPr>
+        <w:ind w:left="5400" w:hanging="360"/>
+      </w:pPr>
+      <w:rPr>
+        <w:rFonts w:ascii="Courier New" w:hAnsi="Courier New" w:cs="Courier New" w:hint="default"/>
+      </w:rPr>
+    </w:lvl>
+    <w:lvl w:ilvl="8" w:tplc="08090005" w:tentative="1">
+      <w:start w:val="1"/>
+      <w:numFmt w:val="bullet"/>
+      <w:lvlText w:val=""/>
+      <w:lvlJc w:val="left"/>
+      <w:pPr>
+        <w:ind w:left="6120" w:hanging="360"/>
+      </w:pPr>
+      <w:rPr>
+        <w:rFonts w:ascii="Wingdings" w:hAnsi="Wingdings" w:hint="default"/>
+      </w:rPr>
+    </w:lvl>
+  </w:abstractNum>
   <w:num w:numId="1" w16cid:durableId="187376041">
     <w:abstractNumId w:val="0"/>
   </w:num>
   <w:num w:numId="2" w16cid:durableId="694236038">
     <w:abstractNumId w:val="1"/>
+  </w:num>
+  <w:num w:numId="3" w16cid:durableId="1355882026">
+    <w:abstractNumId w:val="2"/>
   </w:num>
 </w:numbering>
 </file>

</xml_diff>